<commit_message>
Fix Gemini SSE parsing, chat scrolling and citation detection; tune hybrid retrieval
Gemini separates SSE events with CRLF, so the reader now normalizes line
endings and flushes the trailing buffer; an empty answer is treated as a
provider failure instead of a silent blank bubble. The message list gets
min-height: 0 so it scrolls inside the thread on desktop and mobile.
Citations now accept "[Art. 100, literal a]", "(Art. 12)", "Arts. 34 y 35"
and bare "Artículo 7". RRF uses k = 10 with 40 candidates (hybrid 35/35 on
the suggested questions). Adds `npm run clave:base64`, accepts a plain key
in VITE_GEMINI_API_KEY_B64, and refreshes docs with real screenshots.

Co-Authored-By: Claude Fable 5.1 <noreply@anthropic.com>
</commit_message>
<xml_diff>
--- a/ProyectoFinal_ChatbotEstatutoUASD/docs/Documento-tecnico.docx
+++ b/ProyectoFinal_ChatbotEstatutoUASD/docs/Documento-tecnico.docx
@@ -5007,7 +5007,7 @@
           <w:sz w:val="22"/>
           <w:szCs w:val="22"/>
         </w:rPr>
-        <w:t xml:space="preserve">Para medir la recuperación se usan las 35 preguntas del enunciado, cada una asociada al capítulo donde debería hallarse la respuesta. El script evaluar-recuperacion.ts calcula el acierto@5: con búsqueda léxica BM25, 35 de 35 preguntas tienen un artículo del capítulo esperado entre los cinco primeros resultados. La cifra es optimista porque la regla que favorece artículos definitorios se ajustó observando estas mismas preguntas; la búsqueda híbrida con embeddings se evalúa con el mismo script.</w:t>
+        <w:t xml:space="preserve">Para medir la recuperación se usan las 35 preguntas del enunciado, cada una asociada al capítulo donde debería hallarse la respuesta. El script evaluar-recuperacion.ts calcula el acierto@5 (¿hay un artículo del capítulo esperado entre los cinco primeros resultados?). Resultados: BM25 35/35, vectorial 35/35 e híbrida 35/35. La híbrida requirió ajustar la fusión: con el valor clásico k = 60 de RRF daba 33/35, porque con solo dos listas un artículo que es primero en una de ellas pierde frente a artículos mediocres presentes en ambas; con k = 10 y 40 candidatos por lista el problema desaparece. La cifra es optimista porque tanto la regla que favorece artículos definitorios como estos parámetros se ajustaron observando estas mismas preguntas.</w:t>
       </w:r>
     </w:p>
     <w:p>
@@ -5310,7 +5310,7 @@
                 <w:sz w:val="20"/>
                 <w:szCs w:val="20"/>
               </w:rPr>
-              <w:t xml:space="preserve">Acierto@5 con las 35 preguntas sugeridas</w:t>
+              <w:t xml:space="preserve">Acierto@5 con las 35 preguntas sugeridas: BM25, vectorial e híbrida en 35/35</w:t>
             </w:r>
           </w:p>
         </w:tc>
@@ -5343,6 +5343,104 @@
                 <w:szCs w:val="20"/>
               </w:rPr>
               <w:t xml:space="preserve">npm run evaluar</w:t>
+            </w:r>
+          </w:p>
+        </w:tc>
+      </w:tr>
+      <w:tr>
+        <w:tc>
+          <w:tcPr>
+            <w:tcW w:type="dxa" w:w="2000"/>
+            <w:tcBorders>
+              <w:top w:val="single" w:color="E1E7F0" w:sz="4"/>
+              <w:left w:val="single" w:color="E1E7F0" w:sz="4"/>
+              <w:bottom w:val="single" w:color="E1E7F0" w:sz="4"/>
+              <w:right w:val="single" w:color="E1E7F0" w:sz="4"/>
+            </w:tcBorders>
+            <w:tcMar>
+              <w:top w:type="dxa" w:w="80"/>
+              <w:left w:type="dxa" w:w="120"/>
+              <w:bottom w:type="dxa" w:w="80"/>
+              <w:right w:type="dxa" w:w="120"/>
+            </w:tcMar>
+          </w:tcPr>
+          <w:p>
+            <w:pPr>
+              <w:spacing w:after="0"/>
+            </w:pPr>
+            <w:r>
+              <w:rPr>
+                <w:rFonts w:ascii="Calibri" w:cs="Calibri" w:eastAsia="Calibri" w:hAnsi="Calibri"/>
+                <w:b w:val="false"/>
+                <w:bCs w:val="false"/>
+                <w:sz w:val="20"/>
+                <w:szCs w:val="20"/>
+              </w:rPr>
+              <w:t xml:space="preserve">Extremo a extremo (12 comprobaciones)</w:t>
+            </w:r>
+          </w:p>
+        </w:tc>
+        <w:tc>
+          <w:tcPr>
+            <w:tcW w:type="dxa" w:w="5160"/>
+            <w:tcBorders>
+              <w:top w:val="single" w:color="E1E7F0" w:sz="4"/>
+              <w:left w:val="single" w:color="E1E7F0" w:sz="4"/>
+              <w:bottom w:val="single" w:color="E1E7F0" w:sz="4"/>
+              <w:right w:val="single" w:color="E1E7F0" w:sz="4"/>
+            </w:tcBorders>
+            <w:tcMar>
+              <w:top w:type="dxa" w:w="80"/>
+              <w:left w:type="dxa" w:w="120"/>
+              <w:bottom w:type="dxa" w:w="80"/>
+              <w:right w:type="dxa" w:w="120"/>
+            </w:tcMar>
+          </w:tcPr>
+          <w:p>
+            <w:pPr>
+              <w:spacing w:after="0"/>
+            </w:pPr>
+            <w:r>
+              <w:rPr>
+                <w:rFonts w:ascii="Calibri" w:cs="Calibri" w:eastAsia="Calibri" w:hAnsi="Calibri"/>
+                <w:b w:val="false"/>
+                <w:bCs w:val="false"/>
+                <w:sz w:val="20"/>
+                <w:szCs w:val="20"/>
+              </w:rPr>
+              <w:t xml:space="preserve">Respuestas reales de Gemini redactadas con citas (incluido un seguimiento), traza con búsqueda vectorial activa, desplazamiento del hilo en escritorio y móvil, pregunta ajena al Estatuto respondida con la frase fija</w:t>
+            </w:r>
+          </w:p>
+        </w:tc>
+        <w:tc>
+          <w:tcPr>
+            <w:tcW w:type="dxa" w:w="2200"/>
+            <w:tcBorders>
+              <w:top w:val="single" w:color="E1E7F0" w:sz="4"/>
+              <w:left w:val="single" w:color="E1E7F0" w:sz="4"/>
+              <w:bottom w:val="single" w:color="E1E7F0" w:sz="4"/>
+              <w:right w:val="single" w:color="E1E7F0" w:sz="4"/>
+            </w:tcBorders>
+            <w:tcMar>
+              <w:top w:type="dxa" w:w="80"/>
+              <w:left w:type="dxa" w:w="120"/>
+              <w:bottom w:type="dxa" w:w="80"/>
+              <w:right w:type="dxa" w:w="120"/>
+            </w:tcMar>
+          </w:tcPr>
+          <w:p>
+            <w:pPr>
+              <w:spacing w:after="0"/>
+            </w:pPr>
+            <w:r>
+              <w:rPr>
+                <w:rFonts w:ascii="Calibri" w:cs="Calibri" w:eastAsia="Calibri" w:hAnsi="Calibri"/>
+                <w:b w:val="false"/>
+                <w:bCs w:val="false"/>
+                <w:sz w:val="20"/>
+                <w:szCs w:val="20"/>
+              </w:rPr>
+              <w:t xml:space="preserve">Playwright con la clave real del proyecto</w:t>
             </w:r>
           </w:p>
         </w:tc>

</xml_diff>